<commit_message>
Added routes for static files in nginx
</commit_message>
<xml_diff>
--- a/Readme.docx
+++ b/Readme.docx
@@ -4036,6 +4036,127 @@
         <w:pStyle w:val="Heading3"/>
       </w:pPr>
       <w:r>
+        <w:t>Serve static files</w:t>
+      </w:r>
+    </w:p>
+    <w:p>
+      <w:r>
+        <w:rPr>
+          <w:b w:val="0"/>
+        </w:rPr>
+        <w:t xml:space="preserve">Place any file in </w:t>
+      </w:r>
+      <w:r>
+        <w:rPr>
+          <w:rFonts w:ascii="Courier New" w:hAnsi="Courier New"/>
+          <w:b w:val="0"/>
+          <w:color w:val="C7254E"/>
+          <w:sz w:val="19"/>
+        </w:rPr>
+        <w:t>/var/www/html/</w:t>
+      </w:r>
+      <w:r>
+        <w:rPr>
+          <w:b w:val="0"/>
+        </w:rPr>
+        <w:t xml:space="preserve"> on the host and it will be publicly accessible at:</w:t>
+      </w:r>
+    </w:p>
+    <w:p>
+      <w:pPr>
+        <w:spacing w:before="80" w:after="80"/>
+        <w:shd w:val="clear" w:color="auto" w:fill="F0F0F0"/>
+      </w:pPr>
+      <w:r>
+        <w:rPr>
+          <w:rFonts w:ascii="Courier New" w:hAnsi="Courier New"/>
+          <w:color w:val="202020"/>
+          <w:sz w:val="18"/>
+        </w:rPr>
+        <w:t>https://&lt;MATRIX_DOMAIN&gt;/download/&lt;filename&gt;</w:t>
+      </w:r>
+    </w:p>
+    <w:p>
+      <w:r>
+        <w:rPr>
+          <w:b w:val="0"/>
+        </w:rPr>
+        <w:t xml:space="preserve">For example, uploading </w:t>
+      </w:r>
+      <w:r>
+        <w:rPr>
+          <w:rFonts w:ascii="Courier New" w:hAnsi="Courier New"/>
+          <w:b w:val="0"/>
+          <w:color w:val="C7254E"/>
+          <w:sz w:val="19"/>
+        </w:rPr>
+        <w:t>/var/www/html/photo.jpg</w:t>
+      </w:r>
+      <w:r>
+        <w:rPr>
+          <w:b w:val="0"/>
+        </w:rPr>
+        <w:t xml:space="preserve"> makes it available at </w:t>
+      </w:r>
+      <w:r>
+        <w:rPr>
+          <w:rFonts w:ascii="Courier New" w:hAnsi="Courier New"/>
+          <w:b w:val="0"/>
+          <w:color w:val="C7254E"/>
+          <w:sz w:val="19"/>
+        </w:rPr>
+        <w:t>https://&lt;MATRIX_DOMAIN&gt;/download/photo.jpg</w:t>
+      </w:r>
+      <w:r>
+        <w:rPr>
+          <w:b w:val="0"/>
+        </w:rPr>
+        <w:t>.</w:t>
+      </w:r>
+    </w:p>
+    <w:p>
+      <w:r>
+        <w:rPr>
+          <w:b w:val="0"/>
+        </w:rPr>
+        <w:t>Files must be readable by others (</w:t>
+      </w:r>
+      <w:r>
+        <w:rPr>
+          <w:rFonts w:ascii="Courier New" w:hAnsi="Courier New"/>
+          <w:b w:val="0"/>
+          <w:color w:val="C7254E"/>
+          <w:sz w:val="19"/>
+        </w:rPr>
+        <w:t>chmod 644</w:t>
+      </w:r>
+      <w:r>
+        <w:rPr>
+          <w:b w:val="0"/>
+        </w:rPr>
+        <w:t xml:space="preserve"> for files, </w:t>
+      </w:r>
+      <w:r>
+        <w:rPr>
+          <w:rFonts w:ascii="Courier New" w:hAnsi="Courier New"/>
+          <w:b w:val="0"/>
+          <w:color w:val="C7254E"/>
+          <w:sz w:val="19"/>
+        </w:rPr>
+        <w:t>chmod 755</w:t>
+      </w:r>
+      <w:r>
+        <w:rPr>
+          <w:b w:val="0"/>
+        </w:rPr>
+        <w:t xml:space="preserve"> for directories).</w:t>
+      </w:r>
+    </w:p>
+    <w:p>
+      <w:pPr>
+        <w:pStyle w:val="Heading3"/>
+      </w:pPr>
+      <w:r>
         <w:t>Certificate renewal</w:t>
       </w:r>
     </w:p>

</xml_diff>